<commit_message>
vault backup: 2026-09-22 18:57:05
</commit_message>
<xml_diff>
--- a/符号集.docx
+++ b/符号集.docx
@@ -11,9 +11,9 @@
       </w:pPr>
       <w:r>
         <w:rPr>
-          <w:position w:val="-4"/>
-        </w:rPr>
-        <w:object w:dxaOrig="260" w:dyaOrig="260" w14:anchorId="23619AE6">
+          <w:position w:val="-6"/>
+        </w:rPr>
+        <w:object w:dxaOrig="260" w:dyaOrig="279" w14:anchorId="3D46BFC7">
           <v:shapetype id="_x0000_t75" coordsize="21600,21600" o:spt="75" o:preferrelative="t" path="m@4@5l@4@11@9@11@9@5xe" filled="f" stroked="f">
             <v:stroke joinstyle="miter"/>
             <v:formulas>
@@ -33,21 +33,32 @@
             <v:path o:extrusionok="f" gradientshapeok="t" o:connecttype="rect"/>
             <o:lock v:ext="edit" aspectratio="t"/>
           </v:shapetype>
-          <v:shape id="_x0000_i1032" type="#_x0000_t75" style="width:12.8pt;height:12.8pt" o:ole="">
+          <v:shape id="_x0000_i1046" type="#_x0000_t75" style="width:12.85pt;height:13.85pt" o:ole="">
             <v:imagedata r:id="rId4" o:title=""/>
           </v:shape>
-          <o:OLEObject Type="Embed" ProgID="Equation.DSMT4" ShapeID="_x0000_i1032" DrawAspect="Content" ObjectID="_1851438832" r:id="rId5"/>
+          <o:OLEObject Type="Embed" ProgID="Equation.DSMT4" ShapeID="_x0000_i1046" DrawAspect="Content" ObjectID="_1851535293" r:id="rId5"/>
         </w:object>
       </w:r>
       <w:r>
         <w:rPr>
           <w:position w:val="-4"/>
         </w:rPr>
+        <w:object w:dxaOrig="260" w:dyaOrig="260" w14:anchorId="23619AE6">
+          <v:shape id="_x0000_i1025" type="#_x0000_t75" style="width:12.85pt;height:12.85pt" o:ole="">
+            <v:imagedata r:id="rId6" o:title=""/>
+          </v:shape>
+          <o:OLEObject Type="Embed" ProgID="Equation.DSMT4" ShapeID="_x0000_i1025" DrawAspect="Content" ObjectID="_1851535294" r:id="rId7"/>
+        </w:object>
+      </w:r>
+      <w:r>
+        <w:rPr>
+          <w:position w:val="-4"/>
+        </w:rPr>
         <w:object w:dxaOrig="240" w:dyaOrig="260" w14:anchorId="1F16A914">
-          <v:shape id="_x0000_i1030" type="#_x0000_t75" style="width:11.85pt;height:12.8pt" o:ole="">
-            <v:imagedata r:id="rId6" o:title=""/>
-          </v:shape>
-          <o:OLEObject Type="Embed" ProgID="Equation.DSMT4" ShapeID="_x0000_i1030" DrawAspect="Content" ObjectID="_1851438833" r:id="rId7"/>
+          <v:shape id="_x0000_i1026" type="#_x0000_t75" style="width:11.85pt;height:12.85pt" o:ole="">
+            <v:imagedata r:id="rId8" o:title=""/>
+          </v:shape>
+          <o:OLEObject Type="Embed" ProgID="Equation.DSMT4" ShapeID="_x0000_i1026" DrawAspect="Content" ObjectID="_1851535295" r:id="rId9"/>
         </w:object>
       </w:r>
       <w:r>
@@ -61,10 +72,10 @@
           <w:position w:val="-6"/>
         </w:rPr>
         <w:object w:dxaOrig="240" w:dyaOrig="279" w14:anchorId="3952114C">
-          <v:shape id="_x0000_i1059" type="#_x0000_t75" style="width:11.85pt;height:13.75pt" o:ole="">
-            <v:imagedata r:id="rId8" o:title=""/>
-          </v:shape>
-          <o:OLEObject Type="Embed" ProgID="Equation.DSMT4" ShapeID="_x0000_i1059" DrawAspect="Content" ObjectID="_1851438834" r:id="rId9"/>
+          <v:shape id="_x0000_i1027" type="#_x0000_t75" style="width:11.85pt;height:13.85pt" o:ole="">
+            <v:imagedata r:id="rId10" o:title=""/>
+          </v:shape>
+          <o:OLEObject Type="Embed" ProgID="Equation.DSMT4" ShapeID="_x0000_i1027" DrawAspect="Content" ObjectID="_1851535296" r:id="rId11"/>
         </w:object>
       </w:r>
       <w:r>
@@ -78,10 +89,104 @@
           <w:position w:val="-4"/>
         </w:rPr>
         <w:object w:dxaOrig="240" w:dyaOrig="260" w14:anchorId="5CA46C3A">
-          <v:shape id="_x0000_i1062" type="#_x0000_t75" style="width:11.85pt;height:12.8pt" o:ole="">
-            <v:imagedata r:id="rId10" o:title=""/>
-          </v:shape>
-          <o:OLEObject Type="Embed" ProgID="Equation.DSMT4" ShapeID="_x0000_i1062" DrawAspect="Content" ObjectID="_1851438835" r:id="rId11"/>
+          <v:shape id="_x0000_i1028" type="#_x0000_t75" style="width:11.85pt;height:12.85pt" o:ole="">
+            <v:imagedata r:id="rId12" o:title=""/>
+          </v:shape>
+          <o:OLEObject Type="Embed" ProgID="Equation.DSMT4" ShapeID="_x0000_i1028" DrawAspect="Content" ObjectID="_1851535297" r:id="rId13"/>
+        </w:object>
+      </w:r>
+      <w:r>
+        <w:rPr>
+          <w:position w:val="-24"/>
+        </w:rPr>
+        <w:object w:dxaOrig="300" w:dyaOrig="620" w14:anchorId="7697023F">
+          <v:shape id="_x0000_i1049" type="#_x0000_t75" style="width:14.85pt;height:31.1pt" o:ole="">
+            <v:imagedata r:id="rId14" o:title=""/>
+          </v:shape>
+          <o:OLEObject Type="Embed" ProgID="Equation.DSMT4" ShapeID="_x0000_i1049" DrawAspect="Content" ObjectID="_1851535298" r:id="rId15"/>
+        </w:object>
+      </w:r>
+      <w:r>
+        <w:rPr>
+          <w:rFonts w:hint="eastAsia"/>
+        </w:rPr>
+        <w:t xml:space="preserve"> </w:t>
+      </w:r>
+      <w:r>
+        <w:rPr>
+          <w:position w:val="-4"/>
+        </w:rPr>
+        <w:object w:dxaOrig="220" w:dyaOrig="220" w14:anchorId="5CC82062">
+          <v:shape id="_x0000_i1052" type="#_x0000_t75" style="width:11.15pt;height:11.15pt" o:ole="">
+            <v:imagedata r:id="rId16" o:title=""/>
+          </v:shape>
+          <o:OLEObject Type="Embed" ProgID="Equation.DSMT4" ShapeID="_x0000_i1052" DrawAspect="Content" ObjectID="_1851535299" r:id="rId17"/>
+        </w:object>
+      </w:r>
+      <w:r>
+        <w:rPr>
+          <w:position w:val="-4"/>
+        </w:rPr>
+        <w:object w:dxaOrig="200" w:dyaOrig="160" w14:anchorId="135BC972">
+          <v:shape id="_x0000_i1055" type="#_x0000_t75" style="width:10.15pt;height:8.1pt" o:ole="">
+            <v:imagedata r:id="rId18" o:title=""/>
+          </v:shape>
+          <o:OLEObject Type="Embed" ProgID="Equation.DSMT4" ShapeID="_x0000_i1055" DrawAspect="Content" ObjectID="_1851535300" r:id="rId19"/>
+        </w:object>
+      </w:r>
+      <w:r>
+        <w:rPr>
+          <w:position w:val="-24"/>
+        </w:rPr>
+        <w:object w:dxaOrig="639" w:dyaOrig="620" w14:anchorId="30096586">
+          <v:shape id="_x0000_i1058" type="#_x0000_t75" style="width:32.1pt;height:31.1pt" o:ole="">
+            <v:imagedata r:id="rId20" o:title=""/>
+          </v:shape>
+          <o:OLEObject Type="Embed" ProgID="Equation.DSMT4" ShapeID="_x0000_i1058" DrawAspect="Content" ObjectID="_1851535301" r:id="rId21"/>
+        </w:object>
+      </w:r>
+      <w:r>
+        <w:rPr>
+          <w:position w:val="-4"/>
+        </w:rPr>
+        <w:object w:dxaOrig="580" w:dyaOrig="260" w14:anchorId="5F593D49">
+          <v:shape id="_x0000_i1061" type="#_x0000_t75" style="width:29.05pt;height:12.85pt" o:ole="">
+            <v:imagedata r:id="rId22" o:title=""/>
+          </v:shape>
+          <o:OLEObject Type="Embed" ProgID="Equation.DSMT4" ShapeID="_x0000_i1061" DrawAspect="Content" ObjectID="_1851535302" r:id="rId23"/>
+        </w:object>
+      </w:r>
+      <w:r>
+        <w:rPr>
+          <w:position w:val="-6"/>
+        </w:rPr>
+        <w:object w:dxaOrig="960" w:dyaOrig="279" w14:anchorId="44F808B9">
+          <v:shape id="_x0000_i1064" type="#_x0000_t75" style="width:48pt;height:13.85pt" o:ole="">
+            <v:imagedata r:id="rId24" o:title=""/>
+          </v:shape>
+          <o:OLEObject Type="Embed" ProgID="Equation.DSMT4" ShapeID="_x0000_i1064" DrawAspect="Content" ObjectID="_1851535303" r:id="rId25"/>
+        </w:object>
+      </w:r>
+      <w:r>
+        <w:rPr>
+          <w:position w:val="-6"/>
+        </w:rPr>
+        <w:object w:dxaOrig="440" w:dyaOrig="279" w14:anchorId="0DE0219E">
+          <v:shape id="_x0000_i1067" type="#_x0000_t75" style="width:21.95pt;height:13.85pt" o:ole="">
+            <v:imagedata r:id="rId26" o:title=""/>
+          </v:shape>
+          <o:OLEObject Type="Embed" ProgID="Equation.DSMT4" ShapeID="_x0000_i1067" DrawAspect="Content" ObjectID="_1851535304" r:id="rId27"/>
+        </w:object>
+      </w:r>
+      <w:r>
+        <w:rPr>
+          <w:position w:val="-6"/>
+        </w:rPr>
+        <w:object w:dxaOrig="440" w:dyaOrig="279" w14:anchorId="2E8801D8">
+          <v:shape id="_x0000_i1070" type="#_x0000_t75" style="width:21.95pt;height:13.85pt" o:ole="">
+            <v:imagedata r:id="rId28" o:title=""/>
+          </v:shape>
+          <o:OLEObject Type="Embed" ProgID="Equation.DSMT4" ShapeID="_x0000_i1070" DrawAspect="Content" ObjectID="_1851535305" r:id="rId29"/>
         </w:object>
       </w:r>
     </w:p>
@@ -94,10 +199,10 @@
           <w:position w:val="-4"/>
         </w:rPr>
         <w:object w:dxaOrig="820" w:dyaOrig="260" w14:anchorId="204A4613">
-          <v:shape id="_x0000_i1035" type="#_x0000_t75" style="width:41.2pt;height:12.8pt" o:ole="">
-            <v:imagedata r:id="rId12" o:title=""/>
-          </v:shape>
-          <o:OLEObject Type="Embed" ProgID="Equation.DSMT4" ShapeID="_x0000_i1035" DrawAspect="Content" ObjectID="_1851438836" r:id="rId13"/>
+          <v:shape id="_x0000_i1029" type="#_x0000_t75" style="width:41.25pt;height:12.85pt" o:ole="">
+            <v:imagedata r:id="rId30" o:title=""/>
+          </v:shape>
+          <o:OLEObject Type="Embed" ProgID="Equation.DSMT4" ShapeID="_x0000_i1029" DrawAspect="Content" ObjectID="_1851535306" r:id="rId31"/>
         </w:object>
       </w:r>
     </w:p>
@@ -110,10 +215,10 @@
           <w:position w:val="-4"/>
         </w:rPr>
         <w:object w:dxaOrig="1040" w:dyaOrig="260" w14:anchorId="3854FA59">
-          <v:shape id="_x0000_i1044" type="#_x0000_t75" style="width:52.1pt;height:12.8pt" o:ole="">
-            <v:imagedata r:id="rId14" o:title=""/>
-          </v:shape>
-          <o:OLEObject Type="Embed" ProgID="Equation.DSMT4" ShapeID="_x0000_i1044" DrawAspect="Content" ObjectID="_1851438837" r:id="rId15"/>
+          <v:shape id="_x0000_i1030" type="#_x0000_t75" style="width:52.05pt;height:12.85pt" o:ole="">
+            <v:imagedata r:id="rId32" o:title=""/>
+          </v:shape>
+          <o:OLEObject Type="Embed" ProgID="Equation.DSMT4" ShapeID="_x0000_i1030" DrawAspect="Content" ObjectID="_1851535307" r:id="rId33"/>
         </w:object>
       </w:r>
     </w:p>
@@ -126,10 +231,10 @@
           <w:position w:val="-6"/>
         </w:rPr>
         <w:object w:dxaOrig="260" w:dyaOrig="279" w14:anchorId="1CBB9637">
-          <v:shape id="_x0000_i1038" type="#_x0000_t75" style="width:12.8pt;height:13.75pt" o:ole="">
-            <v:imagedata r:id="rId16" o:title=""/>
-          </v:shape>
-          <o:OLEObject Type="Embed" ProgID="Equation.DSMT4" ShapeID="_x0000_i1038" DrawAspect="Content" ObjectID="_1851438838" r:id="rId17"/>
+          <v:shape id="_x0000_i1031" type="#_x0000_t75" style="width:12.85pt;height:13.85pt" o:ole="">
+            <v:imagedata r:id="rId34" o:title=""/>
+          </v:shape>
+          <o:OLEObject Type="Embed" ProgID="Equation.DSMT4" ShapeID="_x0000_i1031" DrawAspect="Content" ObjectID="_1851535308" r:id="rId35"/>
         </w:object>
       </w:r>
       <w:r>
@@ -137,10 +242,10 @@
           <w:position w:val="-4"/>
         </w:rPr>
         <w:object w:dxaOrig="340" w:dyaOrig="260" w14:anchorId="13BE14EE">
-          <v:shape id="_x0000_i1041" type="#_x0000_t75" style="width:17.05pt;height:12.8pt" o:ole="">
-            <v:imagedata r:id="rId18" o:title=""/>
-          </v:shape>
-          <o:OLEObject Type="Embed" ProgID="Equation.DSMT4" ShapeID="_x0000_i1041" DrawAspect="Content" ObjectID="_1851438839" r:id="rId19"/>
+          <v:shape id="_x0000_i1032" type="#_x0000_t75" style="width:16.9pt;height:12.85pt" o:ole="">
+            <v:imagedata r:id="rId36" o:title=""/>
+          </v:shape>
+          <o:OLEObject Type="Embed" ProgID="Equation.DSMT4" ShapeID="_x0000_i1032" DrawAspect="Content" ObjectID="_1851535309" r:id="rId37"/>
         </w:object>
       </w:r>
       <w:r>
@@ -148,46 +253,10 @@
           <w:position w:val="-4"/>
         </w:rPr>
         <w:object w:dxaOrig="340" w:dyaOrig="260" w14:anchorId="32D858FA">
-          <v:shape id="_x0000_i1073" type="#_x0000_t75" style="width:17.05pt;height:12.8pt" o:ole="">
-            <v:imagedata r:id="rId20" o:title=""/>
-          </v:shape>
-          <o:OLEObject Type="Embed" ProgID="Equation.DSMT4" ShapeID="_x0000_i1073" DrawAspect="Content" ObjectID="_1851438840" r:id="rId21"/>
-        </w:object>
-      </w:r>
-    </w:p>
-    <w:p>
-      <w:pPr>
-        <w:ind w:firstLine="560"/>
-        <w:rPr>
-          <w:rFonts w:hint="eastAsia"/>
-        </w:rPr>
-      </w:pPr>
-      <w:r>
-        <w:rPr>
-          <w:position w:val="-4"/>
-        </w:rPr>
-        <w:object w:dxaOrig="139" w:dyaOrig="260" w14:anchorId="68544125">
-          <v:shape id="_x0000_i1047" type="#_x0000_t75" style="width:7.1pt;height:12.8pt" o:ole="">
-            <v:imagedata r:id="rId22" o:title=""/>
-          </v:shape>
-          <o:OLEObject Type="Embed" ProgID="Equation.DSMT4" ShapeID="_x0000_i1047" DrawAspect="Content" ObjectID="_1851438841" r:id="rId23"/>
-        </w:object>
-      </w:r>
-      <w:r>
-        <w:rPr>
-          <w:rFonts w:hint="eastAsia"/>
-        </w:rPr>
-        <w:t xml:space="preserve"> </w:t>
-      </w:r>
-      <w:r>
-        <w:rPr>
-          <w:position w:val="-4"/>
-        </w:rPr>
-        <w:object w:dxaOrig="200" w:dyaOrig="180" w14:anchorId="11FDEC51">
-          <v:shape id="_x0000_i1076" type="#_x0000_t75" style="width:9.95pt;height:9pt" o:ole="">
-            <v:imagedata r:id="rId24" o:title=""/>
-          </v:shape>
-          <o:OLEObject Type="Embed" ProgID="Equation.DSMT4" ShapeID="_x0000_i1076" DrawAspect="Content" ObjectID="_1851438842" r:id="rId25"/>
+          <v:shape id="_x0000_i1033" type="#_x0000_t75" style="width:16.9pt;height:12.85pt" o:ole="">
+            <v:imagedata r:id="rId38" o:title=""/>
+          </v:shape>
+          <o:OLEObject Type="Embed" ProgID="Equation.DSMT4" ShapeID="_x0000_i1033" DrawAspect="Content" ObjectID="_1851535310" r:id="rId39"/>
         </w:object>
       </w:r>
     </w:p>
@@ -197,24 +266,30 @@
       </w:pPr>
       <w:r>
         <w:rPr>
-          <w:position w:val="-6"/>
-        </w:rPr>
-        <w:object w:dxaOrig="1359" w:dyaOrig="340" w14:anchorId="27CEC7AA">
-          <v:shape id="_x0000_i1065" type="#_x0000_t75" style="width:67.75pt;height:17.05pt" o:ole="">
-            <v:imagedata r:id="rId26" o:title=""/>
-          </v:shape>
-          <o:OLEObject Type="Embed" ProgID="Equation.DSMT4" ShapeID="_x0000_i1065" DrawAspect="Content" ObjectID="_1851438843" r:id="rId27"/>
-        </w:object>
-      </w:r>
-      <w:r>
-        <w:rPr>
           <w:position w:val="-4"/>
         </w:rPr>
-        <w:object w:dxaOrig="1040" w:dyaOrig="320" w14:anchorId="65B28228">
-          <v:shape id="_x0000_i1056" type="#_x0000_t75" style="width:52.1pt;height:16.1pt" o:ole="">
-            <v:imagedata r:id="rId28" o:title=""/>
-          </v:shape>
-          <o:OLEObject Type="Embed" ProgID="Equation.DSMT4" ShapeID="_x0000_i1056" DrawAspect="Content" ObjectID="_1851438844" r:id="rId29"/>
+        <w:object w:dxaOrig="139" w:dyaOrig="260" w14:anchorId="68544125">
+          <v:shape id="_x0000_i1034" type="#_x0000_t75" style="width:7.1pt;height:12.85pt" o:ole="">
+            <v:imagedata r:id="rId40" o:title=""/>
+          </v:shape>
+          <o:OLEObject Type="Embed" ProgID="Equation.DSMT4" ShapeID="_x0000_i1034" DrawAspect="Content" ObjectID="_1851535311" r:id="rId41"/>
+        </w:object>
+      </w:r>
+      <w:r>
+        <w:rPr>
+          <w:rFonts w:hint="eastAsia"/>
+        </w:rPr>
+        <w:t xml:space="preserve"> </w:t>
+      </w:r>
+      <w:r>
+        <w:rPr>
+          <w:position w:val="-4"/>
+        </w:rPr>
+        <w:object w:dxaOrig="200" w:dyaOrig="180" w14:anchorId="11FDEC51">
+          <v:shape id="_x0000_i1035" type="#_x0000_t75" style="width:9.8pt;height:9.15pt" o:ole="">
+            <v:imagedata r:id="rId42" o:title=""/>
+          </v:shape>
+          <o:OLEObject Type="Embed" ProgID="Equation.DSMT4" ShapeID="_x0000_i1035" DrawAspect="Content" ObjectID="_1851535312" r:id="rId43"/>
         </w:object>
       </w:r>
     </w:p>
@@ -224,13 +299,24 @@
       </w:pPr>
       <w:r>
         <w:rPr>
+          <w:position w:val="-6"/>
+        </w:rPr>
+        <w:object w:dxaOrig="1359" w:dyaOrig="340" w14:anchorId="27CEC7AA">
+          <v:shape id="_x0000_i1036" type="#_x0000_t75" style="width:67.6pt;height:16.9pt" o:ole="">
+            <v:imagedata r:id="rId44" o:title=""/>
+          </v:shape>
+          <o:OLEObject Type="Embed" ProgID="Equation.DSMT4" ShapeID="_x0000_i1036" DrawAspect="Content" ObjectID="_1851535313" r:id="rId45"/>
+        </w:object>
+      </w:r>
+      <w:r>
+        <w:rPr>
           <w:position w:val="-4"/>
         </w:rPr>
-        <w:object w:dxaOrig="820" w:dyaOrig="320" w14:anchorId="5753454C">
-          <v:shape id="_x0000_i1053" type="#_x0000_t75" style="width:41.2pt;height:16.1pt" o:ole="">
-            <v:imagedata r:id="rId30" o:title=""/>
-          </v:shape>
-          <o:OLEObject Type="Embed" ProgID="Equation.DSMT4" ShapeID="_x0000_i1053" DrawAspect="Content" ObjectID="_1851438845" r:id="rId31"/>
+        <w:object w:dxaOrig="1040" w:dyaOrig="320" w14:anchorId="65B28228">
+          <v:shape id="_x0000_i1037" type="#_x0000_t75" style="width:52.05pt;height:16.25pt" o:ole="">
+            <v:imagedata r:id="rId46" o:title=""/>
+          </v:shape>
+          <o:OLEObject Type="Embed" ProgID="Equation.DSMT4" ShapeID="_x0000_i1037" DrawAspect="Content" ObjectID="_1851535314" r:id="rId47"/>
         </w:object>
       </w:r>
     </w:p>
@@ -242,11 +328,11 @@
         <w:rPr>
           <w:position w:val="-4"/>
         </w:rPr>
-        <w:object w:dxaOrig="660" w:dyaOrig="320" w14:anchorId="042491FC">
-          <v:shape id="_x0000_i1050" type="#_x0000_t75" style="width:33.15pt;height:16.1pt" o:ole="">
-            <v:imagedata r:id="rId32" o:title=""/>
-          </v:shape>
-          <o:OLEObject Type="Embed" ProgID="Equation.DSMT4" ShapeID="_x0000_i1050" DrawAspect="Content" ObjectID="_1851438846" r:id="rId33"/>
+        <w:object w:dxaOrig="820" w:dyaOrig="320" w14:anchorId="5753454C">
+          <v:shape id="_x0000_i1038" type="#_x0000_t75" style="width:41.25pt;height:16.25pt" o:ole="">
+            <v:imagedata r:id="rId48" o:title=""/>
+          </v:shape>
+          <o:OLEObject Type="Embed" ProgID="Equation.DSMT4" ShapeID="_x0000_i1038" DrawAspect="Content" ObjectID="_1851535315" r:id="rId49"/>
         </w:object>
       </w:r>
     </w:p>
@@ -256,13 +342,29 @@
       </w:pPr>
       <w:r>
         <w:rPr>
+          <w:position w:val="-4"/>
+        </w:rPr>
+        <w:object w:dxaOrig="660" w:dyaOrig="320" w14:anchorId="042491FC">
+          <v:shape id="_x0000_i1039" type="#_x0000_t75" style="width:33.15pt;height:16.25pt" o:ole="">
+            <v:imagedata r:id="rId50" o:title=""/>
+          </v:shape>
+          <o:OLEObject Type="Embed" ProgID="Equation.DSMT4" ShapeID="_x0000_i1039" DrawAspect="Content" ObjectID="_1851535316" r:id="rId51"/>
+        </w:object>
+      </w:r>
+    </w:p>
+    <w:p>
+      <w:pPr>
+        <w:ind w:firstLine="560"/>
+      </w:pPr>
+      <w:r>
+        <w:rPr>
           <w:position w:val="-8"/>
         </w:rPr>
         <w:object w:dxaOrig="1060" w:dyaOrig="300" w14:anchorId="038C700E">
-          <v:shape id="_x0000_i1079" type="#_x0000_t75" style="width:53.05pt;height:15.15pt" o:ole="">
-            <v:imagedata r:id="rId34" o:title=""/>
-          </v:shape>
-          <o:OLEObject Type="Embed" ProgID="Equation.DSMT4" ShapeID="_x0000_i1079" DrawAspect="Content" ObjectID="_1851438847" r:id="rId35"/>
+          <v:shape id="_x0000_i1040" type="#_x0000_t75" style="width:53.05pt;height:15.2pt" o:ole="">
+            <v:imagedata r:id="rId52" o:title=""/>
+          </v:shape>
+          <o:OLEObject Type="Embed" ProgID="Equation.DSMT4" ShapeID="_x0000_i1040" DrawAspect="Content" ObjectID="_1851535317" r:id="rId53"/>
         </w:object>
       </w:r>
       <w:r>
@@ -270,10 +372,10 @@
           <w:position w:val="-6"/>
         </w:rPr>
         <w:object w:dxaOrig="1060" w:dyaOrig="279" w14:anchorId="05B4DCF2">
-          <v:shape id="_x0000_i1070" type="#_x0000_t75" style="width:53.05pt;height:13.75pt" o:ole="">
-            <v:imagedata r:id="rId36" o:title=""/>
-          </v:shape>
-          <o:OLEObject Type="Embed" ProgID="Equation.DSMT4" ShapeID="_x0000_i1070" DrawAspect="Content" ObjectID="_1851438848" r:id="rId37"/>
+          <v:shape id="_x0000_i1041" type="#_x0000_t75" style="width:53.05pt;height:13.85pt" o:ole="">
+            <v:imagedata r:id="rId54" o:title=""/>
+          </v:shape>
+          <o:OLEObject Type="Embed" ProgID="Equation.DSMT4" ShapeID="_x0000_i1041" DrawAspect="Content" ObjectID="_1851535318" r:id="rId55"/>
         </w:object>
       </w:r>
     </w:p>

</xml_diff>

<commit_message>
chore: vault backup 2026-10-21
</commit_message>
<xml_diff>
--- a/符号集.docx
+++ b/符号集.docx
@@ -30,10 +30,10 @@
             <v:path o:extrusionok="f" gradientshapeok="t" o:connecttype="rect"/>
             <o:lock v:ext="edit" aspectratio="t"/>
           </v:shapetype>
-          <v:shape id="_x0000_i1025" type="#_x0000_t75" style="width:12.85pt;height:13.85pt" o:ole="">
+          <v:shape id="_x0000_i1025" type="#_x0000_t75" style="width:12.7pt;height:13.7pt" o:ole="">
             <v:imagedata r:id="rId4" o:title=""/>
           </v:shape>
-          <o:OLEObject Type="Embed" ProgID="Equation.DSMT4" ShapeID="_x0000_i1025" DrawAspect="Content" ObjectID="_1852403329" r:id="rId5"/>
+          <o:OLEObject Type="Embed" ProgID="Equation.DSMT4" ShapeID="_x0000_i1025" DrawAspect="Content" ObjectID="_1853427573" r:id="rId5"/>
         </w:object>
       </w:r>
       <w:r>
@@ -41,10 +41,10 @@
           <w:position w:val="-4"/>
         </w:rPr>
         <w:object w:dxaOrig="260" w:dyaOrig="260" w14:anchorId="23619AE6">
-          <v:shape id="_x0000_i1026" type="#_x0000_t75" style="width:12.85pt;height:12.85pt" o:ole="">
+          <v:shape id="_x0000_i1026" type="#_x0000_t75" style="width:12.7pt;height:12.7pt" o:ole="">
             <v:imagedata r:id="rId6" o:title=""/>
           </v:shape>
-          <o:OLEObject Type="Embed" ProgID="Equation.DSMT4" ShapeID="_x0000_i1026" DrawAspect="Content" ObjectID="_1852403330" r:id="rId7"/>
+          <o:OLEObject Type="Embed" ProgID="Equation.DSMT4" ShapeID="_x0000_i1026" DrawAspect="Content" ObjectID="_1853427574" r:id="rId7"/>
         </w:object>
       </w:r>
       <w:r>
@@ -52,10 +52,10 @@
           <w:position w:val="-4"/>
         </w:rPr>
         <w:object w:dxaOrig="240" w:dyaOrig="260" w14:anchorId="1F16A914">
-          <v:shape id="_x0000_i1027" type="#_x0000_t75" style="width:11.85pt;height:12.85pt" o:ole="">
+          <v:shape id="_x0000_i1027" type="#_x0000_t75" style="width:11.65pt;height:12.7pt" o:ole="">
             <v:imagedata r:id="rId8" o:title=""/>
           </v:shape>
-          <o:OLEObject Type="Embed" ProgID="Equation.DSMT4" ShapeID="_x0000_i1027" DrawAspect="Content" ObjectID="_1852403331" r:id="rId9"/>
+          <o:OLEObject Type="Embed" ProgID="Equation.DSMT4" ShapeID="_x0000_i1027" DrawAspect="Content" ObjectID="_1853427575" r:id="rId9"/>
         </w:object>
       </w:r>
       <w:r>
@@ -69,10 +69,10 @@
           <w:position w:val="-6"/>
         </w:rPr>
         <w:object w:dxaOrig="240" w:dyaOrig="279" w14:anchorId="3952114C">
-          <v:shape id="_x0000_i1028" type="#_x0000_t75" style="width:11.85pt;height:13.85pt" o:ole="">
+          <v:shape id="_x0000_i1028" type="#_x0000_t75" style="width:11.65pt;height:13.7pt" o:ole="">
             <v:imagedata r:id="rId10" o:title=""/>
           </v:shape>
-          <o:OLEObject Type="Embed" ProgID="Equation.DSMT4" ShapeID="_x0000_i1028" DrawAspect="Content" ObjectID="_1852403332" r:id="rId11"/>
+          <o:OLEObject Type="Embed" ProgID="Equation.DSMT4" ShapeID="_x0000_i1028" DrawAspect="Content" ObjectID="_1853427576" r:id="rId11"/>
         </w:object>
       </w:r>
       <w:r>
@@ -86,10 +86,10 @@
           <w:position w:val="-4"/>
         </w:rPr>
         <w:object w:dxaOrig="240" w:dyaOrig="260" w14:anchorId="5CA46C3A">
-          <v:shape id="_x0000_i1029" type="#_x0000_t75" style="width:11.85pt;height:12.85pt" o:ole="">
+          <v:shape id="_x0000_i1029" type="#_x0000_t75" style="width:11.65pt;height:12.7pt" o:ole="">
             <v:imagedata r:id="rId12" o:title=""/>
           </v:shape>
-          <o:OLEObject Type="Embed" ProgID="Equation.DSMT4" ShapeID="_x0000_i1029" DrawAspect="Content" ObjectID="_1852403333" r:id="rId13"/>
+          <o:OLEObject Type="Embed" ProgID="Equation.DSMT4" ShapeID="_x0000_i1029" DrawAspect="Content" ObjectID="_1853427577" r:id="rId13"/>
         </w:object>
       </w:r>
       <w:r>
@@ -97,10 +97,10 @@
           <w:position w:val="-24"/>
         </w:rPr>
         <w:object w:dxaOrig="300" w:dyaOrig="620" w14:anchorId="7697023F">
-          <v:shape id="_x0000_i1030" type="#_x0000_t75" style="width:14.85pt;height:31.1pt" o:ole="">
+          <v:shape id="_x0000_i1030" type="#_x0000_t75" style="width:14.7pt;height:30.95pt" o:ole="">
             <v:imagedata r:id="rId14" o:title=""/>
           </v:shape>
-          <o:OLEObject Type="Embed" ProgID="Equation.DSMT4" ShapeID="_x0000_i1030" DrawAspect="Content" ObjectID="_1852403334" r:id="rId15"/>
+          <o:OLEObject Type="Embed" ProgID="Equation.DSMT4" ShapeID="_x0000_i1030" DrawAspect="Content" ObjectID="_1853427578" r:id="rId15"/>
         </w:object>
       </w:r>
       <w:r>
@@ -117,7 +117,7 @@
           <v:shape id="_x0000_i1031" type="#_x0000_t75" style="width:11.15pt;height:11.15pt" o:ole="">
             <v:imagedata r:id="rId16" o:title=""/>
           </v:shape>
-          <o:OLEObject Type="Embed" ProgID="Equation.DSMT4" ShapeID="_x0000_i1031" DrawAspect="Content" ObjectID="_1852403335" r:id="rId17"/>
+          <o:OLEObject Type="Embed" ProgID="Equation.DSMT4" ShapeID="_x0000_i1031" DrawAspect="Content" ObjectID="_1853427579" r:id="rId17"/>
         </w:object>
       </w:r>
       <w:r>
@@ -128,7 +128,7 @@
           <v:shape id="_x0000_i1032" type="#_x0000_t75" style="width:10.15pt;height:8.1pt" o:ole="">
             <v:imagedata r:id="rId18" o:title=""/>
           </v:shape>
-          <o:OLEObject Type="Embed" ProgID="Equation.DSMT4" ShapeID="_x0000_i1032" DrawAspect="Content" ObjectID="_1852403336" r:id="rId19"/>
+          <o:OLEObject Type="Embed" ProgID="Equation.DSMT4" ShapeID="_x0000_i1032" DrawAspect="Content" ObjectID="_1853427580" r:id="rId19"/>
         </w:object>
       </w:r>
       <w:r>
@@ -136,10 +136,10 @@
           <w:position w:val="-24"/>
         </w:rPr>
         <w:object w:dxaOrig="639" w:dyaOrig="620" w14:anchorId="30096586">
-          <v:shape id="_x0000_i1033" type="#_x0000_t75" style="width:32.1pt;height:31.1pt" o:ole="">
+          <v:shape id="_x0000_i1033" type="#_x0000_t75" style="width:31.95pt;height:30.95pt" o:ole="">
             <v:imagedata r:id="rId20" o:title=""/>
           </v:shape>
-          <o:OLEObject Type="Embed" ProgID="Equation.DSMT4" ShapeID="_x0000_i1033" DrawAspect="Content" ObjectID="_1852403337" r:id="rId21"/>
+          <o:OLEObject Type="Embed" ProgID="Equation.DSMT4" ShapeID="_x0000_i1033" DrawAspect="Content" ObjectID="_1853427581" r:id="rId21"/>
         </w:object>
       </w:r>
       <w:r>
@@ -147,10 +147,10 @@
           <w:position w:val="-4"/>
         </w:rPr>
         <w:object w:dxaOrig="580" w:dyaOrig="260" w14:anchorId="5F593D49">
-          <v:shape id="_x0000_i1034" type="#_x0000_t75" style="width:29.05pt;height:12.85pt" o:ole="">
+          <v:shape id="_x0000_i1034" type="#_x0000_t75" style="width:28.9pt;height:12.7pt" o:ole="">
             <v:imagedata r:id="rId22" o:title=""/>
           </v:shape>
-          <o:OLEObject Type="Embed" ProgID="Equation.DSMT4" ShapeID="_x0000_i1034" DrawAspect="Content" ObjectID="_1852403338" r:id="rId23"/>
+          <o:OLEObject Type="Embed" ProgID="Equation.DSMT4" ShapeID="_x0000_i1034" DrawAspect="Content" ObjectID="_1853427582" r:id="rId23"/>
         </w:object>
       </w:r>
       <w:r>
@@ -158,10 +158,10 @@
           <w:position w:val="-6"/>
         </w:rPr>
         <w:object w:dxaOrig="960" w:dyaOrig="279" w14:anchorId="44F808B9">
-          <v:shape id="_x0000_i1035" type="#_x0000_t75" style="width:48pt;height:13.85pt" o:ole="">
+          <v:shape id="_x0000_i1035" type="#_x0000_t75" style="width:48.15pt;height:13.7pt" o:ole="">
             <v:imagedata r:id="rId24" o:title=""/>
           </v:shape>
-          <o:OLEObject Type="Embed" ProgID="Equation.DSMT4" ShapeID="_x0000_i1035" DrawAspect="Content" ObjectID="_1852403339" r:id="rId25"/>
+          <o:OLEObject Type="Embed" ProgID="Equation.DSMT4" ShapeID="_x0000_i1035" DrawAspect="Content" ObjectID="_1853427583" r:id="rId25"/>
         </w:object>
       </w:r>
       <w:r>
@@ -169,10 +169,10 @@
           <w:position w:val="-6"/>
         </w:rPr>
         <w:object w:dxaOrig="440" w:dyaOrig="279" w14:anchorId="0DE0219E">
-          <v:shape id="_x0000_i1036" type="#_x0000_t75" style="width:21.95pt;height:13.85pt" o:ole="">
+          <v:shape id="_x0000_i1036" type="#_x0000_t75" style="width:21.8pt;height:13.7pt" o:ole="">
             <v:imagedata r:id="rId26" o:title=""/>
           </v:shape>
-          <o:OLEObject Type="Embed" ProgID="Equation.DSMT4" ShapeID="_x0000_i1036" DrawAspect="Content" ObjectID="_1852403340" r:id="rId27"/>
+          <o:OLEObject Type="Embed" ProgID="Equation.DSMT4" ShapeID="_x0000_i1036" DrawAspect="Content" ObjectID="_1853427584" r:id="rId27"/>
         </w:object>
       </w:r>
       <w:r>
@@ -180,10 +180,10 @@
           <w:position w:val="-6"/>
         </w:rPr>
         <w:object w:dxaOrig="440" w:dyaOrig="279" w14:anchorId="2E8801D8">
-          <v:shape id="_x0000_i1037" type="#_x0000_t75" style="width:21.95pt;height:13.85pt" o:ole="">
+          <v:shape id="_x0000_i1037" type="#_x0000_t75" style="width:21.8pt;height:13.7pt" o:ole="">
             <v:imagedata r:id="rId28" o:title=""/>
           </v:shape>
-          <o:OLEObject Type="Embed" ProgID="Equation.DSMT4" ShapeID="_x0000_i1037" DrawAspect="Content" ObjectID="_1852403341" r:id="rId29"/>
+          <o:OLEObject Type="Embed" ProgID="Equation.DSMT4" ShapeID="_x0000_i1037" DrawAspect="Content" ObjectID="_1853427585" r:id="rId29"/>
         </w:object>
       </w:r>
     </w:p>
@@ -196,10 +196,10 @@
           <w:position w:val="-4"/>
         </w:rPr>
         <w:object w:dxaOrig="820" w:dyaOrig="260" w14:anchorId="204A4613">
-          <v:shape id="_x0000_i1038" type="#_x0000_t75" style="width:41.25pt;height:12.85pt" o:ole="">
+          <v:shape id="_x0000_i1038" type="#_x0000_t75" style="width:41.05pt;height:12.7pt" o:ole="">
             <v:imagedata r:id="rId30" o:title=""/>
           </v:shape>
-          <o:OLEObject Type="Embed" ProgID="Equation.DSMT4" ShapeID="_x0000_i1038" DrawAspect="Content" ObjectID="_1852403342" r:id="rId31"/>
+          <o:OLEObject Type="Embed" ProgID="Equation.DSMT4" ShapeID="_x0000_i1038" DrawAspect="Content" ObjectID="_1853427586" r:id="rId31"/>
         </w:object>
       </w:r>
     </w:p>
@@ -212,10 +212,10 @@
           <w:position w:val="-4"/>
         </w:rPr>
         <w:object w:dxaOrig="1040" w:dyaOrig="260" w14:anchorId="3854FA59">
-          <v:shape id="_x0000_i1039" type="#_x0000_t75" style="width:52.05pt;height:12.85pt" o:ole="">
+          <v:shape id="_x0000_i1039" type="#_x0000_t75" style="width:52.25pt;height:12.7pt" o:ole="">
             <v:imagedata r:id="rId32" o:title=""/>
           </v:shape>
-          <o:OLEObject Type="Embed" ProgID="Equation.DSMT4" ShapeID="_x0000_i1039" DrawAspect="Content" ObjectID="_1852403343" r:id="rId33"/>
+          <o:OLEObject Type="Embed" ProgID="Equation.DSMT4" ShapeID="_x0000_i1039" DrawAspect="Content" ObjectID="_1853427587" r:id="rId33"/>
         </w:object>
       </w:r>
     </w:p>
@@ -228,10 +228,10 @@
           <w:position w:val="-6"/>
         </w:rPr>
         <w:object w:dxaOrig="260" w:dyaOrig="279" w14:anchorId="1CBB9637">
-          <v:shape id="_x0000_i1040" type="#_x0000_t75" style="width:12.85pt;height:13.85pt" o:ole="">
+          <v:shape id="_x0000_i1040" type="#_x0000_t75" style="width:12.7pt;height:13.7pt" o:ole="">
             <v:imagedata r:id="rId34" o:title=""/>
           </v:shape>
-          <o:OLEObject Type="Embed" ProgID="Equation.DSMT4" ShapeID="_x0000_i1040" DrawAspect="Content" ObjectID="_1852403344" r:id="rId35"/>
+          <o:OLEObject Type="Embed" ProgID="Equation.DSMT4" ShapeID="_x0000_i1040" DrawAspect="Content" ObjectID="_1853427588" r:id="rId35"/>
         </w:object>
       </w:r>
       <w:r>
@@ -239,10 +239,10 @@
           <w:position w:val="-4"/>
         </w:rPr>
         <w:object w:dxaOrig="340" w:dyaOrig="260" w14:anchorId="13BE14EE">
-          <v:shape id="_x0000_i1041" type="#_x0000_t75" style="width:16.9pt;height:12.85pt" o:ole="">
+          <v:shape id="_x0000_i1041" type="#_x0000_t75" style="width:16.75pt;height:12.7pt" o:ole="">
             <v:imagedata r:id="rId36" o:title=""/>
           </v:shape>
-          <o:OLEObject Type="Embed" ProgID="Equation.DSMT4" ShapeID="_x0000_i1041" DrawAspect="Content" ObjectID="_1852403345" r:id="rId37"/>
+          <o:OLEObject Type="Embed" ProgID="Equation.DSMT4" ShapeID="_x0000_i1041" DrawAspect="Content" ObjectID="_1853427589" r:id="rId37"/>
         </w:object>
       </w:r>
       <w:r>
@@ -250,10 +250,10 @@
           <w:position w:val="-4"/>
         </w:rPr>
         <w:object w:dxaOrig="340" w:dyaOrig="260" w14:anchorId="32D858FA">
-          <v:shape id="_x0000_i1042" type="#_x0000_t75" style="width:16.9pt;height:12.85pt" o:ole="">
+          <v:shape id="_x0000_i1042" type="#_x0000_t75" style="width:16.75pt;height:12.7pt" o:ole="">
             <v:imagedata r:id="rId38" o:title=""/>
           </v:shape>
-          <o:OLEObject Type="Embed" ProgID="Equation.DSMT4" ShapeID="_x0000_i1042" DrawAspect="Content" ObjectID="_1852403346" r:id="rId39"/>
+          <o:OLEObject Type="Embed" ProgID="Equation.DSMT4" ShapeID="_x0000_i1042" DrawAspect="Content" ObjectID="_1853427590" r:id="rId39"/>
         </w:object>
       </w:r>
     </w:p>
@@ -266,10 +266,10 @@
           <w:position w:val="-4"/>
         </w:rPr>
         <w:object w:dxaOrig="139" w:dyaOrig="260" w14:anchorId="68544125">
-          <v:shape id="_x0000_i1043" type="#_x0000_t75" style="width:7.1pt;height:12.85pt" o:ole="">
+          <v:shape id="_x0000_i1043" type="#_x0000_t75" style="width:7.1pt;height:12.7pt" o:ole="">
             <v:imagedata r:id="rId40" o:title=""/>
           </v:shape>
-          <o:OLEObject Type="Embed" ProgID="Equation.DSMT4" ShapeID="_x0000_i1043" DrawAspect="Content" ObjectID="_1852403347" r:id="rId41"/>
+          <o:OLEObject Type="Embed" ProgID="Equation.DSMT4" ShapeID="_x0000_i1043" DrawAspect="Content" ObjectID="_1853427591" r:id="rId41"/>
         </w:object>
       </w:r>
       <w:r>
@@ -283,10 +283,10 @@
           <w:position w:val="-4"/>
         </w:rPr>
         <w:object w:dxaOrig="200" w:dyaOrig="180" w14:anchorId="11FDEC51">
-          <v:shape id="_x0000_i1044" type="#_x0000_t75" style="width:9.8pt;height:9.15pt" o:ole="">
+          <v:shape id="_x0000_i1044" type="#_x0000_t75" style="width:9.65pt;height:9.15pt" o:ole="">
             <v:imagedata r:id="rId42" o:title=""/>
           </v:shape>
-          <o:OLEObject Type="Embed" ProgID="Equation.DSMT4" ShapeID="_x0000_i1044" DrawAspect="Content" ObjectID="_1852403348" r:id="rId43"/>
+          <o:OLEObject Type="Embed" ProgID="Equation.DSMT4" ShapeID="_x0000_i1044" DrawAspect="Content" ObjectID="_1853427592" r:id="rId43"/>
         </w:object>
       </w:r>
     </w:p>
@@ -299,10 +299,10 @@
           <w:position w:val="-6"/>
         </w:rPr>
         <w:object w:dxaOrig="1359" w:dyaOrig="340" w14:anchorId="27CEC7AA">
-          <v:shape id="_x0000_i1045" type="#_x0000_t75" style="width:67.6pt;height:16.9pt" o:ole="">
+          <v:shape id="_x0000_i1045" type="#_x0000_t75" style="width:67.45pt;height:16.75pt" o:ole="">
             <v:imagedata r:id="rId44" o:title=""/>
           </v:shape>
-          <o:OLEObject Type="Embed" ProgID="Equation.DSMT4" ShapeID="_x0000_i1045" DrawAspect="Content" ObjectID="_1852403349" r:id="rId45"/>
+          <o:OLEObject Type="Embed" ProgID="Equation.DSMT4" ShapeID="_x0000_i1045" DrawAspect="Content" ObjectID="_1853427593" r:id="rId45"/>
         </w:object>
       </w:r>
       <w:r>
@@ -310,10 +310,10 @@
           <w:position w:val="-4"/>
         </w:rPr>
         <w:object w:dxaOrig="1040" w:dyaOrig="320" w14:anchorId="65B28228">
-          <v:shape id="_x0000_i1046" type="#_x0000_t75" style="width:52.05pt;height:16.25pt" o:ole="">
+          <v:shape id="_x0000_i1046" type="#_x0000_t75" style="width:52.25pt;height:16.25pt" o:ole="">
             <v:imagedata r:id="rId46" o:title=""/>
           </v:shape>
-          <o:OLEObject Type="Embed" ProgID="Equation.DSMT4" ShapeID="_x0000_i1046" DrawAspect="Content" ObjectID="_1852403350" r:id="rId47"/>
+          <o:OLEObject Type="Embed" ProgID="Equation.DSMT4" ShapeID="_x0000_i1046" DrawAspect="Content" ObjectID="_1853427594" r:id="rId47"/>
         </w:object>
       </w:r>
     </w:p>
@@ -326,10 +326,10 @@
           <w:position w:val="-4"/>
         </w:rPr>
         <w:object w:dxaOrig="820" w:dyaOrig="320" w14:anchorId="5753454C">
-          <v:shape id="_x0000_i1047" type="#_x0000_t75" style="width:41.25pt;height:16.25pt" o:ole="">
+          <v:shape id="_x0000_i1047" type="#_x0000_t75" style="width:41.05pt;height:16.25pt" o:ole="">
             <v:imagedata r:id="rId48" o:title=""/>
           </v:shape>
-          <o:OLEObject Type="Embed" ProgID="Equation.DSMT4" ShapeID="_x0000_i1047" DrawAspect="Content" ObjectID="_1852403351" r:id="rId49"/>
+          <o:OLEObject Type="Embed" ProgID="Equation.DSMT4" ShapeID="_x0000_i1047" DrawAspect="Content" ObjectID="_1853427595" r:id="rId49"/>
         </w:object>
       </w:r>
     </w:p>
@@ -342,10 +342,10 @@
           <w:position w:val="-4"/>
         </w:rPr>
         <w:object w:dxaOrig="660" w:dyaOrig="320" w14:anchorId="042491FC">
-          <v:shape id="_x0000_i1048" type="#_x0000_t75" style="width:33.15pt;height:16.25pt" o:ole="">
+          <v:shape id="_x0000_i1048" type="#_x0000_t75" style="width:32.95pt;height:16.25pt" o:ole="">
             <v:imagedata r:id="rId50" o:title=""/>
           </v:shape>
-          <o:OLEObject Type="Embed" ProgID="Equation.DSMT4" ShapeID="_x0000_i1048" DrawAspect="Content" ObjectID="_1852403352" r:id="rId51"/>
+          <o:OLEObject Type="Embed" ProgID="Equation.DSMT4" ShapeID="_x0000_i1048" DrawAspect="Content" ObjectID="_1853427596" r:id="rId51"/>
         </w:object>
       </w:r>
     </w:p>
@@ -358,10 +358,10 @@
           <w:position w:val="-8"/>
         </w:rPr>
         <w:object w:dxaOrig="1060" w:dyaOrig="300" w14:anchorId="038C700E">
-          <v:shape id="_x0000_i1049" type="#_x0000_t75" style="width:53.05pt;height:15.2pt" o:ole="">
+          <v:shape id="_x0000_i1049" type="#_x0000_t75" style="width:53.25pt;height:15.2pt" o:ole="">
             <v:imagedata r:id="rId52" o:title=""/>
           </v:shape>
-          <o:OLEObject Type="Embed" ProgID="Equation.DSMT4" ShapeID="_x0000_i1049" DrawAspect="Content" ObjectID="_1852403353" r:id="rId53"/>
+          <o:OLEObject Type="Embed" ProgID="Equation.DSMT4" ShapeID="_x0000_i1049" DrawAspect="Content" ObjectID="_1853427597" r:id="rId53"/>
         </w:object>
       </w:r>
       <w:r>
@@ -369,68 +369,141 @@
           <w:position w:val="-6"/>
         </w:rPr>
         <w:object w:dxaOrig="1060" w:dyaOrig="279" w14:anchorId="05B4DCF2">
-          <v:shape id="_x0000_i1050" type="#_x0000_t75" style="width:53.05pt;height:13.85pt" o:ole="">
+          <v:shape id="_x0000_i1050" type="#_x0000_t75" style="width:53.25pt;height:13.7pt" o:ole="">
             <v:imagedata r:id="rId54" o:title=""/>
           </v:shape>
-          <o:OLEObject Type="Embed" ProgID="Equation.DSMT4" ShapeID="_x0000_i1050" DrawAspect="Content" ObjectID="_1852403354" r:id="rId55"/>
+          <o:OLEObject Type="Embed" ProgID="Equation.DSMT4" ShapeID="_x0000_i1050" DrawAspect="Content" ObjectID="_1853427598" r:id="rId55"/>
         </w:object>
       </w:r>
     </w:p>
     <w:p>
       <w:pPr>
         <w:ind w:firstLine="560"/>
+      </w:pPr>
+      <w:r>
+        <w:rPr>
+          <w:position w:val="-12"/>
+        </w:rPr>
+        <w:object w:dxaOrig="260" w:dyaOrig="360" w14:anchorId="129D9430">
+          <v:shape id="_x0000_i1051" type="#_x0000_t75" style="width:12.7pt;height:17.75pt" o:ole="">
+            <v:imagedata r:id="rId56" o:title=""/>
+          </v:shape>
+          <o:OLEObject Type="Embed" ProgID="Equation.DSMT4" ShapeID="_x0000_i1051" DrawAspect="Content" ObjectID="_1853427599" r:id="rId57"/>
+        </w:object>
+      </w:r>
+      <w:r>
+        <w:rPr>
+          <w:position w:val="-6"/>
+        </w:rPr>
+        <w:object w:dxaOrig="139" w:dyaOrig="279" w14:anchorId="583F5F70">
+          <v:shape id="_x0000_i1052" type="#_x0000_t75" style="width:7.1pt;height:13.7pt" o:ole="">
+            <v:imagedata r:id="rId58" o:title=""/>
+          </v:shape>
+          <o:OLEObject Type="Embed" ProgID="Equation.DSMT4" ShapeID="_x0000_i1052" DrawAspect="Content" ObjectID="_1853427600" r:id="rId59"/>
+        </w:object>
+      </w:r>
+      <w:r>
+        <w:rPr>
+          <w:position w:val="-6"/>
+        </w:rPr>
+        <w:object w:dxaOrig="260" w:dyaOrig="220" w14:anchorId="35B4DF6F">
+          <v:shape id="_x0000_i1053" type="#_x0000_t75" style="width:12.7pt;height:11.15pt" o:ole="">
+            <v:imagedata r:id="rId60" o:title=""/>
+          </v:shape>
+          <o:OLEObject Type="Embed" ProgID="Equation.DSMT4" ShapeID="_x0000_i1053" DrawAspect="Content" ObjectID="_1853427601" r:id="rId61"/>
+        </w:object>
+      </w:r>
+      <w:r>
         <w:rPr>
           <w:rFonts w:hint="eastAsia"/>
         </w:rPr>
+        <w:t xml:space="preserve"> </w:t>
+      </w:r>
+      <w:r>
+        <w:rPr>
+          <w:position w:val="-6"/>
+        </w:rPr>
+        <w:object w:dxaOrig="240" w:dyaOrig="279" w14:anchorId="343166C2">
+          <v:shape id="_x0000_i1054" type="#_x0000_t75" style="width:12.15pt;height:13.7pt" o:ole="">
+            <v:imagedata r:id="rId62" o:title=""/>
+          </v:shape>
+          <o:OLEObject Type="Embed" ProgID="Equation.DSMT4" ShapeID="_x0000_i1054" DrawAspect="Content" ObjectID="_1853427602" r:id="rId63"/>
+        </w:object>
+      </w:r>
+    </w:p>
+    <w:p>
+      <w:pPr>
+        <w:ind w:firstLine="560"/>
       </w:pPr>
+    </w:p>
+    <w:p>
+      <w:pPr>
+        <w:ind w:firstLine="560"/>
+        <w:rPr>
+          <w:rFonts w:hint="eastAsia"/>
+        </w:rPr>
+      </w:pPr>
       <w:r>
         <w:rPr>
           <w:position w:val="-12"/>
         </w:rPr>
-        <w:object w:dxaOrig="260" w:dyaOrig="360" w14:anchorId="129D9430">
-          <v:shape id="_x0000_i1053" type="#_x0000_t75" style="width:12.85pt;height:17.9pt" o:ole="">
-            <v:imagedata r:id="rId56" o:title=""/>
-          </v:shape>
-          <o:OLEObject Type="Embed" ProgID="Equation.DSMT4" ShapeID="_x0000_i1053" DrawAspect="Content" ObjectID="_1852403355" r:id="rId57"/>
-        </w:object>
-      </w:r>
-      <w:r>
-        <w:rPr>
-          <w:position w:val="-6"/>
-        </w:rPr>
-        <w:object w:dxaOrig="139" w:dyaOrig="279" w14:anchorId="583F5F70">
-          <v:shape id="_x0000_i1057" type="#_x0000_t75" style="width:7.1pt;height:13.85pt" o:ole="">
-            <v:imagedata r:id="rId58" o:title=""/>
-          </v:shape>
-          <o:OLEObject Type="Embed" ProgID="Equation.DSMT4" ShapeID="_x0000_i1057" DrawAspect="Content" ObjectID="_1852403356" r:id="rId59"/>
-        </w:object>
-      </w:r>
-      <w:r>
-        <w:rPr>
-          <w:position w:val="-6"/>
-        </w:rPr>
-        <w:object w:dxaOrig="260" w:dyaOrig="220" w14:anchorId="35B4DF6F">
-          <v:shape id="_x0000_i1060" type="#_x0000_t75" style="width:12.85pt;height:11.15pt" o:ole="">
-            <v:imagedata r:id="rId60" o:title=""/>
-          </v:shape>
-          <o:OLEObject Type="Embed" ProgID="Equation.DSMT4" ShapeID="_x0000_i1060" DrawAspect="Content" ObjectID="_1852403357" r:id="rId61"/>
-        </w:object>
-      </w:r>
-      <w:r>
+        <w:object w:dxaOrig="340" w:dyaOrig="360" w14:anchorId="1808DAFA">
+          <v:shape id="_x0000_i1055" type="#_x0000_t75" style="width:17.25pt;height:18.25pt" o:ole="">
+            <v:imagedata r:id="rId64" o:title=""/>
+          </v:shape>
+          <o:OLEObject Type="Embed" ProgID="Equation.DSMT4" ShapeID="_x0000_i1055" DrawAspect="Content" ObjectID="_1853427603" r:id="rId65"/>
+        </w:object>
+      </w:r>
+      <w:r>
+        <w:rPr>
+          <w:position w:val="-12"/>
+        </w:rPr>
+        <w:object w:dxaOrig="300" w:dyaOrig="360" w14:anchorId="7D394A51">
+          <v:shape id="_x0000_i1056" type="#_x0000_t75" style="width:15.2pt;height:18.25pt" o:ole="">
+            <v:imagedata r:id="rId66" o:title=""/>
+          </v:shape>
+          <o:OLEObject Type="Embed" ProgID="Equation.DSMT4" ShapeID="_x0000_i1056" DrawAspect="Content" ObjectID="_1853427604" r:id="rId67"/>
+        </w:object>
+      </w:r>
+    </w:p>
+    <w:p>
+      <w:pPr>
+        <w:ind w:firstLine="560"/>
         <w:rPr>
           <w:rFonts w:hint="eastAsia"/>
         </w:rPr>
-        <w:t xml:space="preserve"> </w:t>
-      </w:r>
-      <w:r>
-        <w:rPr>
-          <w:position w:val="-6"/>
-        </w:rPr>
-        <w:object w:dxaOrig="240" w:dyaOrig="279" w14:anchorId="343166C2">
-          <v:shape id="_x0000_i1063" type="#_x0000_t75" style="width:12.15pt;height:13.85pt" o:ole="">
-            <v:imagedata r:id="rId62" o:title=""/>
-          </v:shape>
-          <o:OLEObject Type="Embed" ProgID="Equation.DSMT4" ShapeID="_x0000_i1063" DrawAspect="Content" ObjectID="_1852403358" r:id="rId63"/>
+      </w:pPr>
+      <w:r>
+        <w:rPr>
+          <w:position w:val="-14"/>
+        </w:rPr>
+        <w:object w:dxaOrig="320" w:dyaOrig="380" w14:anchorId="0B83D046">
+          <v:shape id="_x0000_i1057" type="#_x0000_t75" style="width:16.25pt;height:18.75pt" o:ole="">
+            <v:imagedata r:id="rId68" o:title=""/>
+          </v:shape>
+          <o:OLEObject Type="Embed" ProgID="Equation.DSMT4" ShapeID="_x0000_i1057" DrawAspect="Content" ObjectID="_1853427605" r:id="rId69"/>
+        </w:object>
+      </w:r>
+      <w:r>
+        <w:rPr>
+          <w:position w:val="-12"/>
+        </w:rPr>
+        <w:object w:dxaOrig="340" w:dyaOrig="360" w14:anchorId="41F83D26">
+          <v:shape id="_x0000_i1058" type="#_x0000_t75" style="width:17.25pt;height:18.25pt" o:ole="">
+            <v:imagedata r:id="rId70" o:title=""/>
+          </v:shape>
+          <o:OLEObject Type="Embed" ProgID="Equation.DSMT4" ShapeID="_x0000_i1058" DrawAspect="Content" ObjectID="_1853427606" r:id="rId71"/>
+        </w:object>
+      </w:r>
+      <w:r>
+        <w:rPr>
+          <w:position w:val="-12"/>
+        </w:rPr>
+        <w:object w:dxaOrig="320" w:dyaOrig="360" w14:anchorId="4C9CBF5E">
+          <v:shape id="_x0000_i1059" type="#_x0000_t75" style="width:16.25pt;height:18.25pt" o:ole="">
+            <v:imagedata r:id="rId72" o:title=""/>
+          </v:shape>
+          <o:OLEObject Type="Embed" ProgID="Equation.DSMT4" ShapeID="_x0000_i1059" DrawAspect="Content" ObjectID="_1853427607" r:id="rId73"/>
         </w:object>
       </w:r>
     </w:p>

</xml_diff>